<commit_message>
[L] Lab 3 Ver 2 - Left only app light, Lab has been accepted this version
</commit_message>
<xml_diff>
--- a/[L]Lab2/iptables_report.docx
+++ b/[L]Lab2/iptables_report.docx
@@ -313,12 +313,14 @@
               </w:rPr>
               <w:t>-</w:t>
             </w:r>
+            <w:proofErr w:type="spellStart"/>
             <w:r>
               <w:rPr>
                 <w:lang w:eastAsia="ru-RU"/>
               </w:rPr>
               <w:t>пу</w:t>
             </w:r>
+            <w:proofErr w:type="spellEnd"/>
           </w:p>
         </w:tc>
         <w:tc>
@@ -431,11 +433,19 @@
                 <w:lang w:eastAsia="ru-RU"/>
               </w:rPr>
             </w:pPr>
+            <w:proofErr w:type="spellStart"/>
             <w:r>
               <w:rPr>
                 <w:lang w:eastAsia="ru-RU"/>
               </w:rPr>
-              <w:t>Киямов Ж. У.</w:t>
+              <w:t>Киямов</w:t>
+            </w:r>
+            <w:proofErr w:type="spellEnd"/>
+            <w:r>
+              <w:rPr>
+                <w:lang w:eastAsia="ru-RU"/>
+              </w:rPr>
+              <w:t xml:space="preserve"> Ж. У.</w:t>
             </w:r>
           </w:p>
         </w:tc>
@@ -1904,6 +1914,7 @@
         </w:rPr>
         <w:t xml:space="preserve">Слушать трафик с помощью </w:t>
       </w:r>
+      <w:proofErr w:type="spellStart"/>
       <w:r>
         <w:rPr>
           <w:b/>
@@ -1912,18 +1923,21 @@
         </w:rPr>
         <w:t>Scapy</w:t>
       </w:r>
+      <w:proofErr w:type="spellEnd"/>
       <w:r>
         <w:t xml:space="preserve">: </w:t>
       </w:r>
       <w:r>
         <w:t xml:space="preserve">В программе должен быть компонент, который будет слушать и анализировать трафик с помощью библиотеки </w:t>
       </w:r>
+      <w:proofErr w:type="spellStart"/>
       <w:r>
         <w:rPr>
           <w:lang w:val="en-US"/>
         </w:rPr>
         <w:t>Scapy</w:t>
       </w:r>
+      <w:proofErr w:type="spellEnd"/>
       <w:r>
         <w:t>.</w:t>
       </w:r>
@@ -2180,12 +2194,21 @@
           <w:numId w:val="18"/>
         </w:numPr>
       </w:pPr>
+      <w:proofErr w:type="spellStart"/>
       <w:r>
         <w:rPr>
           <w:b/>
           <w:bCs/>
         </w:rPr>
-        <w:t>Сниффинг и предварительная обработка</w:t>
+        <w:t>Сниффинг</w:t>
+      </w:r>
+      <w:proofErr w:type="spellEnd"/>
+      <w:r>
+        <w:rPr>
+          <w:b/>
+          <w:bCs/>
+        </w:rPr>
+        <w:t xml:space="preserve"> и предварительная обработка</w:t>
       </w:r>
     </w:p>
     <w:p>
@@ -2194,7 +2217,39 @@
         <w:ind w:firstLine="360"/>
       </w:pPr>
       <w:r>
-        <w:t>Сбор пакетов ведётся на заданном интерфейсе с фильтрами BPF (например, ip). Фильтр отбрасывает «лишнее» ещё в ядре, снижая нагрузку. Обработка идёт без хранения пакетов (streaming, store=False).</w:t>
+        <w:t xml:space="preserve">Сбор пакетов ведётся на заданном интерфейсе с фильтрами BPF (например, </w:t>
+      </w:r>
+      <w:proofErr w:type="spellStart"/>
+      <w:r>
+        <w:t>ip</w:t>
+      </w:r>
+      <w:proofErr w:type="spellEnd"/>
+      <w:r>
+        <w:t>). Фильтр отбрасывает «лишнее» ещё в ядре, снижая нагрузку. Обработка идёт без хранения пакетов (</w:t>
+      </w:r>
+      <w:proofErr w:type="spellStart"/>
+      <w:r>
+        <w:t>streaming</w:t>
+      </w:r>
+      <w:proofErr w:type="spellEnd"/>
+      <w:r>
+        <w:t xml:space="preserve">, </w:t>
+      </w:r>
+      <w:proofErr w:type="spellStart"/>
+      <w:r>
+        <w:t>store</w:t>
+      </w:r>
+      <w:proofErr w:type="spellEnd"/>
+      <w:r>
+        <w:t>=</w:t>
+      </w:r>
+      <w:proofErr w:type="spellStart"/>
+      <w:r>
+        <w:t>False</w:t>
+      </w:r>
+      <w:proofErr w:type="spellEnd"/>
+      <w:r>
+        <w:t>).</w:t>
       </w:r>
       <w:r>
         <w:t>:</w:t>
@@ -2247,12 +2302,14 @@
       <w:r>
         <w:t xml:space="preserve">В работе применяется библиотека </w:t>
       </w:r>
+      <w:proofErr w:type="spellStart"/>
       <w:r>
         <w:rPr>
           <w:lang w:val="en-US"/>
         </w:rPr>
         <w:t>Scapy</w:t>
       </w:r>
+      <w:proofErr w:type="spellEnd"/>
       <w:r>
         <w:t xml:space="preserve">, предоставляющая широкий набор инструментов для </w:t>
       </w:r>
@@ -2295,7 +2352,47 @@
         </w:rPr>
       </w:pPr>
       <w:r>
-        <w:t xml:space="preserve">Из каждого пакета берутся поля src/dst, proto, dport (TCP/UDP), length, метка времени. </w:t>
+        <w:t xml:space="preserve">Из каждого пакета берутся поля </w:t>
+      </w:r>
+      <w:proofErr w:type="spellStart"/>
+      <w:r>
+        <w:t>src</w:t>
+      </w:r>
+      <w:proofErr w:type="spellEnd"/>
+      <w:r>
+        <w:t>/</w:t>
+      </w:r>
+      <w:proofErr w:type="spellStart"/>
+      <w:r>
+        <w:t>dst</w:t>
+      </w:r>
+      <w:proofErr w:type="spellEnd"/>
+      <w:r>
+        <w:t xml:space="preserve">, </w:t>
+      </w:r>
+      <w:proofErr w:type="spellStart"/>
+      <w:r>
+        <w:t>proto</w:t>
+      </w:r>
+      <w:proofErr w:type="spellEnd"/>
+      <w:r>
+        <w:t xml:space="preserve">, </w:t>
+      </w:r>
+      <w:proofErr w:type="spellStart"/>
+      <w:r>
+        <w:t>dport</w:t>
+      </w:r>
+      <w:proofErr w:type="spellEnd"/>
+      <w:r>
+        <w:t xml:space="preserve"> (TCP/UDP), </w:t>
+      </w:r>
+      <w:proofErr w:type="spellStart"/>
+      <w:r>
+        <w:t>length</w:t>
+      </w:r>
+      <w:proofErr w:type="spellEnd"/>
+      <w:r>
+        <w:t xml:space="preserve">, метка времени. </w:t>
       </w:r>
       <w:r>
         <w:t>Ведётся состояние по источникам</w:t>
@@ -2318,12 +2415,14 @@
       <w:r>
         <w:t xml:space="preserve">История прибытия пакетов для каждого </w:t>
       </w:r>
+      <w:proofErr w:type="spellStart"/>
       <w:r>
         <w:rPr>
           <w:lang w:val="en-US"/>
         </w:rPr>
         <w:t>src</w:t>
       </w:r>
+      <w:proofErr w:type="spellEnd"/>
     </w:p>
     <w:p>
       <w:pPr>
@@ -2336,12 +2435,14 @@
       <w:r>
         <w:t xml:space="preserve">Последнее появление </w:t>
       </w:r>
+      <w:proofErr w:type="spellStart"/>
       <w:r>
         <w:rPr>
           <w:lang w:val="en-US"/>
         </w:rPr>
         <w:t>src</w:t>
       </w:r>
+      <w:proofErr w:type="spellEnd"/>
       <w:r>
         <w:t xml:space="preserve"> </w:t>
       </w:r>
@@ -2481,7 +2582,15 @@
         </w:numPr>
       </w:pPr>
       <w:r>
-        <w:t>Глобальный «локдаун»: блокируются все, кроме whitelist;</w:t>
+        <w:t xml:space="preserve">Глобальный «локдаун»: блокируются все, кроме </w:t>
+      </w:r>
+      <w:proofErr w:type="spellStart"/>
+      <w:r>
+        <w:t>whitelist</w:t>
+      </w:r>
+      <w:proofErr w:type="spellEnd"/>
+      <w:r>
+        <w:t>;</w:t>
       </w:r>
     </w:p>
     <w:p>
@@ -2493,7 +2602,15 @@
         </w:numPr>
       </w:pPr>
       <w:r>
-        <w:t>Ручные команды из GUI (Block/Whitelist), авто-блок по порогам.</w:t>
+        <w:t>Ручные команды из GUI (Block/</w:t>
+      </w:r>
+      <w:proofErr w:type="spellStart"/>
+      <w:r>
+        <w:t>Whitelist</w:t>
+      </w:r>
+      <w:proofErr w:type="spellEnd"/>
+      <w:r>
+        <w:t>), авто-блок по порогам.</w:t>
       </w:r>
     </w:p>
     <w:p>
@@ -2638,8 +2755,37 @@
         <w:t xml:space="preserve">. </w:t>
       </w:r>
       <w:r>
-        <w:t>Ядро создаёт каталог логов, готовит файлы detections.jsonl, commands.jsonl, whitelist.jsonl и загружает белый список. Параллельно запускается фоновый поток, который постоянно читает команды из commands.jsonl</w:t>
-      </w:r>
+        <w:t xml:space="preserve">Ядро создаёт каталог логов, готовит файлы </w:t>
+      </w:r>
+      <w:proofErr w:type="spellStart"/>
+      <w:r>
+        <w:t>detections.jsonl</w:t>
+      </w:r>
+      <w:proofErr w:type="spellEnd"/>
+      <w:r>
+        <w:t xml:space="preserve">, </w:t>
+      </w:r>
+      <w:proofErr w:type="spellStart"/>
+      <w:r>
+        <w:t>commands.jsonl</w:t>
+      </w:r>
+      <w:proofErr w:type="spellEnd"/>
+      <w:r>
+        <w:t xml:space="preserve">, </w:t>
+      </w:r>
+      <w:proofErr w:type="spellStart"/>
+      <w:r>
+        <w:t>whitelist.jsonl</w:t>
+      </w:r>
+      <w:proofErr w:type="spellEnd"/>
+      <w:r>
+        <w:t xml:space="preserve"> и загружает белый список. Параллельно запускается фоновый поток, который постоянно читает команды из </w:t>
+      </w:r>
+      <w:proofErr w:type="spellStart"/>
+      <w:r>
+        <w:t>commands.jsonl</w:t>
+      </w:r>
+      <w:proofErr w:type="spellEnd"/>
       <w:r>
         <w:t>.</w:t>
       </w:r>
@@ -2662,18 +2808,32 @@
           <w:numId w:val="20"/>
         </w:numPr>
       </w:pPr>
+      <w:proofErr w:type="spellStart"/>
       <w:r>
         <w:rPr>
           <w:b/>
           <w:bCs/>
         </w:rPr>
-        <w:t>Сниффинг и предварительные отсеки</w:t>
+        <w:t>Сниффинг</w:t>
+      </w:r>
+      <w:proofErr w:type="spellEnd"/>
+      <w:r>
+        <w:rPr>
+          <w:b/>
+          <w:bCs/>
+        </w:rPr>
+        <w:t xml:space="preserve"> и предварительные отсеки</w:t>
       </w:r>
       <w:r>
         <w:t xml:space="preserve">. </w:t>
       </w:r>
-      <w:r>
-        <w:t>Scapy начинает захват пакетов на заданном интерфейсе с BPF-фильтром, каждый пакет немедленно поступает в обработчик. До детекции выполняются быстрые проверки: активен ли глобальный локдаун и не заблокирован ли источник</w:t>
+      <w:proofErr w:type="spellStart"/>
+      <w:r>
+        <w:t>Scapy</w:t>
+      </w:r>
+      <w:proofErr w:type="spellEnd"/>
+      <w:r>
+        <w:t xml:space="preserve"> начинает захват пакетов на заданном интерфейсе с BPF-фильтром, каждый пакет немедленно поступает в обработчик. До детекции выполняются быстрые проверки: активен ли глобальный локдаун и не заблокирован ли источник</w:t>
       </w:r>
       <w:r>
         <w:t>.</w:t>
@@ -2699,7 +2859,15 @@
         <w:t xml:space="preserve">. </w:t>
       </w:r>
       <w:r>
-        <w:t>К пакету применяются правила: высокая частота от одного источника и обращение к нетипичному порту; при срабатывании формируется причина и событие пишется в detections.jsonl. Одновременно обновляются агрегаты — история прибытий по IP и время последнего появления для подсчёта уникальных источников.</w:t>
+        <w:t xml:space="preserve">К пакету применяются правила: высокая частота от одного источника и обращение к нетипичному порту; при срабатывании формируется причина и событие пишется в </w:t>
+      </w:r>
+      <w:proofErr w:type="spellStart"/>
+      <w:r>
+        <w:t>detections.jsonl</w:t>
+      </w:r>
+      <w:proofErr w:type="spellEnd"/>
+      <w:r>
+        <w:t>. Одновременно обновляются агрегаты — история прибытий по IP и время последнего появления для подсчёта уникальных источников.</w:t>
       </w:r>
     </w:p>
     <w:p>
@@ -2731,8 +2899,21 @@
         <w:t xml:space="preserve">. </w:t>
       </w:r>
       <w:r>
-        <w:t>При превышении порогов выполняется автоблокировка IP на заданный срок либо включается глобальный локдаун «все, кроме whitelist». GUI в реальном времени показывает поток детекций и список источников и позволяет оператору вручную отправлять команды Block/Whitelist</w:t>
-      </w:r>
+        <w:t xml:space="preserve">При превышении порогов выполняется автоблокировка IP на заданный срок либо включается глобальный локдаун «все, кроме </w:t>
+      </w:r>
+      <w:proofErr w:type="spellStart"/>
+      <w:r>
+        <w:t>whitelist</w:t>
+      </w:r>
+      <w:proofErr w:type="spellEnd"/>
+      <w:r>
+        <w:t>». GUI в реальном времени показывает поток детекций и список источников и позволяет оператору вручную отправлять команды Block/</w:t>
+      </w:r>
+      <w:proofErr w:type="spellStart"/>
+      <w:r>
+        <w:t>Whitelist</w:t>
+      </w:r>
+      <w:proofErr w:type="spellEnd"/>
     </w:p>
     <w:p/>
     <w:p>
@@ -3060,6 +3241,7 @@
       </w:r>
     </w:p>
     <w:p>
+      <w:proofErr w:type="spellStart"/>
       <w:r>
         <w:rPr>
           <w:b/>
@@ -3068,11 +3250,13 @@
         </w:rPr>
         <w:t>os</w:t>
       </w:r>
+      <w:proofErr w:type="spellEnd"/>
       <w:r>
         <w:t>: Библиотека для работы с файловой системой и выполнения операций над каталогами и файлами.</w:t>
       </w:r>
     </w:p>
     <w:p>
+      <w:proofErr w:type="spellStart"/>
       <w:r>
         <w:rPr>
           <w:b/>
@@ -3082,6 +3266,7 @@
         <w:lastRenderedPageBreak/>
         <w:t>argparse</w:t>
       </w:r>
+      <w:proofErr w:type="spellEnd"/>
       <w:r>
         <w:t xml:space="preserve">: </w:t>
       </w:r>
@@ -3090,6 +3275,7 @@
       </w:r>
     </w:p>
     <w:p>
+      <w:proofErr w:type="spellStart"/>
       <w:r>
         <w:rPr>
           <w:b/>
@@ -3098,6 +3284,7 @@
         </w:rPr>
         <w:t>json</w:t>
       </w:r>
+      <w:proofErr w:type="spellEnd"/>
       <w:r>
         <w:t xml:space="preserve">: </w:t>
       </w:r>
@@ -3119,6 +3306,7 @@
       </w:r>
     </w:p>
     <w:p>
+      <w:proofErr w:type="spellStart"/>
       <w:r>
         <w:rPr>
           <w:b/>
@@ -3126,6 +3314,7 @@
         </w:rPr>
         <w:t>time</w:t>
       </w:r>
+      <w:proofErr w:type="spellEnd"/>
       <w:r>
         <w:t xml:space="preserve">: </w:t>
       </w:r>
@@ -3134,6 +3323,7 @@
       </w:r>
     </w:p>
     <w:p>
+      <w:proofErr w:type="spellStart"/>
       <w:r>
         <w:rPr>
           <w:b/>
@@ -3141,14 +3331,24 @@
         </w:rPr>
         <w:t>threading</w:t>
       </w:r>
+      <w:proofErr w:type="spellEnd"/>
       <w:r>
         <w:t xml:space="preserve">: </w:t>
       </w:r>
       <w:r>
-        <w:t>Фоновый поток для непрерывного чтения commands.jsonl, чтобы не блокировать обработку пакетов.</w:t>
-      </w:r>
-    </w:p>
-    <w:p>
+        <w:t xml:space="preserve">Фоновый поток для непрерывного чтения </w:t>
+      </w:r>
+      <w:proofErr w:type="spellStart"/>
+      <w:r>
+        <w:t>commands.jsonl</w:t>
+      </w:r>
+      <w:proofErr w:type="spellEnd"/>
+      <w:r>
+        <w:t>, чтобы не блокировать обработку пакетов.</w:t>
+      </w:r>
+    </w:p>
+    <w:p>
+      <w:proofErr w:type="spellStart"/>
       <w:r>
         <w:rPr>
           <w:b/>
@@ -3157,6 +3357,7 @@
         </w:rPr>
         <w:t>PyQt</w:t>
       </w:r>
+      <w:proofErr w:type="spellEnd"/>
       <w:r>
         <w:rPr>
           <w:b/>
@@ -3169,6 +3370,7 @@
       </w:r>
     </w:p>
     <w:p>
+      <w:proofErr w:type="spellStart"/>
       <w:r>
         <w:rPr>
           <w:b/>
@@ -3176,11 +3378,21 @@
         </w:rPr>
         <w:t>Scapy</w:t>
       </w:r>
-      <w:r>
-        <w:t>: Сниффинг пакетов с BPF-фильтрами, доступ к полям IP/TCP/UDP и передача пакетов в правила.</w:t>
-      </w:r>
-    </w:p>
-    <w:p>
+      <w:proofErr w:type="spellEnd"/>
+      <w:r>
+        <w:t xml:space="preserve">: </w:t>
+      </w:r>
+      <w:proofErr w:type="spellStart"/>
+      <w:r>
+        <w:t>Сниффинг</w:t>
+      </w:r>
+      <w:proofErr w:type="spellEnd"/>
+      <w:r>
+        <w:t xml:space="preserve"> пакетов с BPF-фильтрами, доступ к полям IP/TCP/UDP и передача пакетов в правила.</w:t>
+      </w:r>
+    </w:p>
+    <w:p>
+      <w:proofErr w:type="spellStart"/>
       <w:r>
         <w:rPr>
           <w:b/>
@@ -3188,6 +3400,7 @@
         </w:rPr>
         <w:t>subprocess</w:t>
       </w:r>
+      <w:proofErr w:type="spellEnd"/>
       <w:r>
         <w:t>: Старт detector.py как подпроцесса из GUI и чтение его стандартного вывода в реальном времени.</w:t>
       </w:r>
@@ -3327,6 +3540,7 @@
                 <w:bCs/>
               </w:rPr>
             </w:pPr>
+            <w:proofErr w:type="spellStart"/>
             <w:r>
               <w:rPr>
                 <w:b/>
@@ -3334,6 +3548,7 @@
               </w:rPr>
               <w:t>record_arrival</w:t>
             </w:r>
+            <w:proofErr w:type="spellEnd"/>
           </w:p>
         </w:tc>
         <w:tc>
@@ -3347,6 +3562,7 @@
                 <w:bCs/>
               </w:rPr>
             </w:pPr>
+            <w:proofErr w:type="spellStart"/>
             <w:r>
               <w:rPr>
                 <w:b/>
@@ -3354,6 +3570,7 @@
               </w:rPr>
               <w:t>src</w:t>
             </w:r>
+            <w:proofErr w:type="spellEnd"/>
           </w:p>
         </w:tc>
         <w:tc>
@@ -3393,7 +3610,15 @@
                     <w:t>пакет</w:t>
                   </w:r>
                   <w:r>
-                    <w:t>: добавляет текущий timestamp в историю и обновляет время последнего появления источника</w:t>
+                    <w:t xml:space="preserve">: добавляет текущий </w:t>
+                  </w:r>
+                  <w:proofErr w:type="spellStart"/>
+                  <w:r>
+                    <w:t>timestamp</w:t>
+                  </w:r>
+                  <w:proofErr w:type="spellEnd"/>
+                  <w:r>
+                    <w:t xml:space="preserve"> в историю и обновляет время последнего появления источника</w:t>
                   </w:r>
                   <w:r>
                     <w:t>.</w:t>
@@ -3461,6 +3686,7 @@
                 <w:lang w:val="en-US"/>
               </w:rPr>
             </w:pPr>
+            <w:proofErr w:type="spellStart"/>
             <w:r>
               <w:rPr>
                 <w:b/>
@@ -3468,6 +3694,7 @@
               </w:rPr>
               <w:t>count_recent</w:t>
             </w:r>
+            <w:proofErr w:type="spellEnd"/>
           </w:p>
         </w:tc>
         <w:tc>
@@ -3482,13 +3709,23 @@
                 <w:lang w:val="en-US"/>
               </w:rPr>
             </w:pPr>
+            <w:proofErr w:type="spellStart"/>
             <w:r>
               <w:rPr>
                 <w:b/>
                 <w:bCs/>
                 <w:lang w:val="en-US"/>
               </w:rPr>
-              <w:t>src, window</w:t>
+              <w:t>src</w:t>
+            </w:r>
+            <w:proofErr w:type="spellEnd"/>
+            <w:r>
+              <w:rPr>
+                <w:b/>
+                <w:bCs/>
+                <w:lang w:val="en-US"/>
+              </w:rPr>
+              <w:t>, window</w:t>
             </w:r>
           </w:p>
         </w:tc>
@@ -3523,7 +3760,23 @@
                 </w:tcPr>
                 <w:p>
                   <w:r>
-                    <w:t>Возвращает число пакетов от src за последние window секунд.</w:t>
+                    <w:t xml:space="preserve">Возвращает число пакетов от </w:t>
+                  </w:r>
+                  <w:proofErr w:type="spellStart"/>
+                  <w:r>
+                    <w:t>src</w:t>
+                  </w:r>
+                  <w:proofErr w:type="spellEnd"/>
+                  <w:r>
+                    <w:t xml:space="preserve"> за последние </w:t>
+                  </w:r>
+                  <w:proofErr w:type="spellStart"/>
+                  <w:r>
+                    <w:t>window</w:t>
+                  </w:r>
+                  <w:proofErr w:type="spellEnd"/>
+                  <w:r>
+                    <w:t xml:space="preserve"> секунд.</w:t>
                   </w:r>
                 </w:p>
               </w:tc>
@@ -3579,6 +3832,7 @@
                 <w:lang w:val="en-US"/>
               </w:rPr>
             </w:pPr>
+            <w:proofErr w:type="spellStart"/>
             <w:r>
               <w:rPr>
                 <w:b/>
@@ -3586,6 +3840,7 @@
               </w:rPr>
               <w:t>emit_event</w:t>
             </w:r>
+            <w:proofErr w:type="spellEnd"/>
           </w:p>
         </w:tc>
         <w:tc>
@@ -3664,7 +3919,15 @@
                       </w:tcPr>
                       <w:p>
                         <w:r>
-                          <w:t>Пишет служебное (мета)-событие в stdout и JSONL.</w:t>
+                          <w:t xml:space="preserve">Пишет служебное (мета)-событие в </w:t>
+                        </w:r>
+                        <w:proofErr w:type="spellStart"/>
+                        <w:r>
+                          <w:t>stdout</w:t>
+                        </w:r>
+                        <w:proofErr w:type="spellEnd"/>
+                        <w:r>
+                          <w:t xml:space="preserve"> и JSONL.</w:t>
                         </w:r>
                       </w:p>
                     </w:tc>
@@ -3768,6 +4031,7 @@
                 <w:bCs/>
               </w:rPr>
             </w:pPr>
+            <w:proofErr w:type="spellStart"/>
             <w:r>
               <w:rPr>
                 <w:b/>
@@ -3775,6 +4039,7 @@
               </w:rPr>
               <w:t>handle_packet</w:t>
             </w:r>
+            <w:proofErr w:type="spellEnd"/>
           </w:p>
         </w:tc>
         <w:tc>
@@ -3795,16 +4060,144 @@
                 <w:bCs/>
                 <w:lang w:val="en-US"/>
               </w:rPr>
-              <w:t>Pkt, jsonl_path, auto_block, ab_treshold</w:t>
-            </w:r>
+              <w:t xml:space="preserve">Pkt, </w:t>
+            </w:r>
+            <w:proofErr w:type="spellStart"/>
             <w:r>
               <w:rPr>
                 <w:b/>
                 <w:bCs/>
                 <w:lang w:val="en-US"/>
               </w:rPr>
-              <w:t>, ab_window, ab_duration, ddos_unique_treshold, ddos_window_sec, ddos_duration</w:t>
-            </w:r>
+              <w:t>jsonl_path</w:t>
+            </w:r>
+            <w:proofErr w:type="spellEnd"/>
+            <w:r>
+              <w:rPr>
+                <w:b/>
+                <w:bCs/>
+                <w:lang w:val="en-US"/>
+              </w:rPr>
+              <w:t xml:space="preserve">, </w:t>
+            </w:r>
+            <w:proofErr w:type="spellStart"/>
+            <w:r>
+              <w:rPr>
+                <w:b/>
+                <w:bCs/>
+                <w:lang w:val="en-US"/>
+              </w:rPr>
+              <w:t>auto_block</w:t>
+            </w:r>
+            <w:proofErr w:type="spellEnd"/>
+            <w:r>
+              <w:rPr>
+                <w:b/>
+                <w:bCs/>
+                <w:lang w:val="en-US"/>
+              </w:rPr>
+              <w:t xml:space="preserve">, </w:t>
+            </w:r>
+            <w:proofErr w:type="spellStart"/>
+            <w:r>
+              <w:rPr>
+                <w:b/>
+                <w:bCs/>
+                <w:lang w:val="en-US"/>
+              </w:rPr>
+              <w:t>ab_treshold</w:t>
+            </w:r>
+            <w:proofErr w:type="spellEnd"/>
+            <w:r>
+              <w:rPr>
+                <w:b/>
+                <w:bCs/>
+                <w:lang w:val="en-US"/>
+              </w:rPr>
+              <w:t xml:space="preserve">, </w:t>
+            </w:r>
+            <w:proofErr w:type="spellStart"/>
+            <w:r>
+              <w:rPr>
+                <w:b/>
+                <w:bCs/>
+                <w:lang w:val="en-US"/>
+              </w:rPr>
+              <w:t>ab_window</w:t>
+            </w:r>
+            <w:proofErr w:type="spellEnd"/>
+            <w:r>
+              <w:rPr>
+                <w:b/>
+                <w:bCs/>
+                <w:lang w:val="en-US"/>
+              </w:rPr>
+              <w:t xml:space="preserve">, </w:t>
+            </w:r>
+            <w:proofErr w:type="spellStart"/>
+            <w:r>
+              <w:rPr>
+                <w:b/>
+                <w:bCs/>
+                <w:lang w:val="en-US"/>
+              </w:rPr>
+              <w:t>ab_duration</w:t>
+            </w:r>
+            <w:proofErr w:type="spellEnd"/>
+            <w:r>
+              <w:rPr>
+                <w:b/>
+                <w:bCs/>
+                <w:lang w:val="en-US"/>
+              </w:rPr>
+              <w:t xml:space="preserve">, </w:t>
+            </w:r>
+            <w:proofErr w:type="spellStart"/>
+            <w:r>
+              <w:rPr>
+                <w:b/>
+                <w:bCs/>
+                <w:lang w:val="en-US"/>
+              </w:rPr>
+              <w:t>ddos_unique_treshold</w:t>
+            </w:r>
+            <w:proofErr w:type="spellEnd"/>
+            <w:r>
+              <w:rPr>
+                <w:b/>
+                <w:bCs/>
+                <w:lang w:val="en-US"/>
+              </w:rPr>
+              <w:t xml:space="preserve">, </w:t>
+            </w:r>
+            <w:proofErr w:type="spellStart"/>
+            <w:r>
+              <w:rPr>
+                <w:b/>
+                <w:bCs/>
+                <w:lang w:val="en-US"/>
+              </w:rPr>
+              <w:t>ddos_window_sec</w:t>
+            </w:r>
+            <w:proofErr w:type="spellEnd"/>
+            <w:r>
+              <w:rPr>
+                <w:b/>
+                <w:bCs/>
+                <w:lang w:val="en-US"/>
+              </w:rPr>
+              <w:t xml:space="preserve">, </w:t>
+            </w:r>
+            <w:proofErr w:type="spellStart"/>
+            <w:r>
+              <w:rPr>
+                <w:b/>
+                <w:bCs/>
+                <w:lang w:val="en-US"/>
+              </w:rPr>
+              <w:t>ddos_duration</w:t>
+            </w:r>
+            <w:proofErr w:type="spellEnd"/>
           </w:p>
         </w:tc>
         <w:tc>
@@ -3813,7 +4206,23 @@
           </w:tcPr>
           <w:p>
             <w:r>
-              <w:t>Основной обработчик пакета: применяет быстрые отсеки (локдаун/персональная блокировка), запускает правила (rules), логирует детекции, обновляет агрегаты, инициирует авто-блок по IP и, при всплеске уникальных источников, включает глобальный локдаун.</w:t>
+              <w:t>Основной обработчик пакета: применяет быстрые отсеки (локдаун/персональная блокировка), запускает правила (</w:t>
+            </w:r>
+            <w:proofErr w:type="spellStart"/>
+            <w:r>
+              <w:t>rules</w:t>
+            </w:r>
+            <w:proofErr w:type="spellEnd"/>
+            <w:r>
+              <w:t xml:space="preserve">), </w:t>
+            </w:r>
+            <w:proofErr w:type="spellStart"/>
+            <w:r>
+              <w:t>логирует</w:t>
+            </w:r>
+            <w:proofErr w:type="spellEnd"/>
+            <w:r>
+              <w:t xml:space="preserve"> детекции, обновляет агрегаты, инициирует авто-блок по IP и, при всплеске уникальных источников, включает глобальный локдаун.</w:t>
             </w:r>
           </w:p>
           <w:p/>
@@ -3833,6 +4242,7 @@
                 <w:lang w:val="en-US"/>
               </w:rPr>
             </w:pPr>
+            <w:proofErr w:type="spellStart"/>
             <w:r>
               <w:rPr>
                 <w:b/>
@@ -3840,6 +4250,7 @@
               </w:rPr>
               <w:t>poll_commands</w:t>
             </w:r>
+            <w:proofErr w:type="spellEnd"/>
           </w:p>
         </w:tc>
         <w:tc>
@@ -3854,14 +4265,34 @@
                 <w:lang w:val="en-US"/>
               </w:rPr>
             </w:pPr>
+            <w:proofErr w:type="spellStart"/>
             <w:r>
               <w:rPr>
                 <w:b/>
                 <w:bCs/>
                 <w:lang w:val="en-US"/>
               </w:rPr>
-              <w:t>Cmd_path, whitelist_path</w:t>
-            </w:r>
+              <w:t>Cmd_path</w:t>
+            </w:r>
+            <w:proofErr w:type="spellEnd"/>
+            <w:r>
+              <w:rPr>
+                <w:b/>
+                <w:bCs/>
+                <w:lang w:val="en-US"/>
+              </w:rPr>
+              <w:t xml:space="preserve">, </w:t>
+            </w:r>
+            <w:proofErr w:type="spellStart"/>
+            <w:r>
+              <w:rPr>
+                <w:b/>
+                <w:bCs/>
+                <w:lang w:val="en-US"/>
+              </w:rPr>
+              <w:t>whitelist_path</w:t>
+            </w:r>
+            <w:proofErr w:type="spellEnd"/>
           </w:p>
         </w:tc>
         <w:tc>
@@ -3915,8 +4346,16 @@
                     <w:rPr>
                       <w:lang w:val="en-US"/>
                     </w:rPr>
-                    <w:t xml:space="preserve"> logs/commands.jsonl</w:t>
+                    <w:t xml:space="preserve"> logs/</w:t>
                   </w:r>
+                  <w:proofErr w:type="spellStart"/>
+                  <w:r>
+                    <w:rPr>
+                      <w:lang w:val="en-US"/>
+                    </w:rPr>
+                    <w:t>commands.jsonl</w:t>
+                  </w:r>
+                  <w:proofErr w:type="spellEnd"/>
                   <w:r>
                     <w:rPr>
                       <w:lang w:val="en-US"/>
@@ -3948,8 +4387,16 @@
                     <w:rPr>
                       <w:lang w:val="en-US"/>
                     </w:rPr>
-                    <w:t>: block, whitelist, unwhitelist</w:t>
+                    <w:t xml:space="preserve">: block, whitelist, </w:t>
                   </w:r>
+                  <w:proofErr w:type="spellStart"/>
+                  <w:r>
+                    <w:rPr>
+                      <w:lang w:val="en-US"/>
+                    </w:rPr>
+                    <w:t>unwhitelist</w:t>
+                  </w:r>
+                  <w:proofErr w:type="spellEnd"/>
                 </w:p>
               </w:tc>
             </w:tr>
@@ -4042,6 +4489,7 @@
                 <w:lang w:val="en-US"/>
               </w:rPr>
             </w:pPr>
+            <w:proofErr w:type="spellStart"/>
             <w:r>
               <w:rPr>
                 <w:b/>
@@ -4050,6 +4498,7 @@
               </w:rPr>
               <w:t>args</w:t>
             </w:r>
+            <w:proofErr w:type="spellEnd"/>
           </w:p>
         </w:tc>
         <w:tc>
@@ -4058,12 +4507,38 @@
           </w:tcPr>
           <w:p>
             <w:r>
-              <w:t xml:space="preserve">Точка входа: парсит аргументы, создаёт каталог логов, инициализирует/загружает </w:t>
-            </w:r>
+              <w:t xml:space="preserve">Точка входа: </w:t>
+            </w:r>
+            <w:proofErr w:type="spellStart"/>
+            <w:r>
+              <w:t>парсит</w:t>
+            </w:r>
+            <w:proofErr w:type="spellEnd"/>
+            <w:r>
+              <w:t xml:space="preserve"> аргументы, создаёт каталог логов, инициализирует/загружает </w:t>
+            </w:r>
+            <w:proofErr w:type="spellStart"/>
             <w:r>
               <w:lastRenderedPageBreak/>
-              <w:t>whitelist, запускает поток poll_commands и scapy.sniff</w:t>
-            </w:r>
+              <w:t>whitelist</w:t>
+            </w:r>
+            <w:proofErr w:type="spellEnd"/>
+            <w:r>
+              <w:t xml:space="preserve">, запускает поток </w:t>
+            </w:r>
+            <w:proofErr w:type="spellStart"/>
+            <w:r>
+              <w:t>poll_commands</w:t>
+            </w:r>
+            <w:proofErr w:type="spellEnd"/>
+            <w:r>
+              <w:t xml:space="preserve"> и </w:t>
+            </w:r>
+            <w:proofErr w:type="spellStart"/>
+            <w:r>
+              <w:t>scapy.sniff</w:t>
+            </w:r>
+            <w:proofErr w:type="spellEnd"/>
             <w:r>
               <w:t>(</w:t>
             </w:r>
@@ -4124,6 +4599,7 @@
         </w:rPr>
         <w:t>.</w:t>
       </w:r>
+      <w:proofErr w:type="spellStart"/>
       <w:r>
         <w:rPr>
           <w:sz w:val="24"/>
@@ -4132,6 +4608,7 @@
         </w:rPr>
         <w:t>py</w:t>
       </w:r>
+      <w:proofErr w:type="spellEnd"/>
     </w:p>
     <w:tbl>
       <w:tblPr>
@@ -4218,6 +4695,7 @@
                 <w:bCs/>
               </w:rPr>
             </w:pPr>
+            <w:proofErr w:type="spellStart"/>
             <w:r>
               <w:rPr>
                 <w:b/>
@@ -4225,6 +4703,7 @@
               </w:rPr>
               <w:t>add_whitelist</w:t>
             </w:r>
+            <w:proofErr w:type="spellEnd"/>
           </w:p>
         </w:tc>
         <w:tc>
@@ -4239,6 +4718,7 @@
                 <w:lang w:val="en-US"/>
               </w:rPr>
             </w:pPr>
+            <w:proofErr w:type="spellStart"/>
             <w:r>
               <w:rPr>
                 <w:b/>
@@ -4247,6 +4727,7 @@
               </w:rPr>
               <w:t>ip</w:t>
             </w:r>
+            <w:proofErr w:type="spellEnd"/>
           </w:p>
         </w:tc>
         <w:tc>
@@ -4301,7 +4782,15 @@
                     <w:t xml:space="preserve"> и </w:t>
                   </w:r>
                   <w:r>
-                    <w:t>фиксирует событие в жкрнал.</w:t>
+                    <w:t xml:space="preserve">фиксирует событие в </w:t>
+                  </w:r>
+                  <w:proofErr w:type="spellStart"/>
+                  <w:r>
+                    <w:t>жкрнал</w:t>
+                  </w:r>
+                  <w:proofErr w:type="spellEnd"/>
+                  <w:r>
+                    <w:t>.</w:t>
                   </w:r>
                   <w:r>
                     <w:t xml:space="preserve"> Возвращает True при успехе.</w:t>
@@ -4369,6 +4858,7 @@
                 <w:lang w:val="en-US"/>
               </w:rPr>
             </w:pPr>
+            <w:proofErr w:type="spellStart"/>
             <w:r>
               <w:rPr>
                 <w:b/>
@@ -4376,6 +4866,7 @@
               </w:rPr>
               <w:t>remove_whitelist</w:t>
             </w:r>
+            <w:proofErr w:type="spellEnd"/>
           </w:p>
         </w:tc>
         <w:tc>
@@ -4390,6 +4881,7 @@
                 <w:lang w:val="en-US"/>
               </w:rPr>
             </w:pPr>
+            <w:proofErr w:type="spellStart"/>
             <w:r>
               <w:rPr>
                 <w:b/>
@@ -4398,6 +4890,7 @@
               </w:rPr>
               <w:t>ip</w:t>
             </w:r>
+            <w:proofErr w:type="spellEnd"/>
           </w:p>
         </w:tc>
         <w:tc>
@@ -4537,6 +5030,7 @@
                       <w:bCs/>
                     </w:rPr>
                   </w:pPr>
+                  <w:proofErr w:type="spellStart"/>
                   <w:r>
                     <w:rPr>
                       <w:b/>
@@ -4544,6 +5038,7 @@
                     </w:rPr>
                     <w:t>set_global_lockdown</w:t>
                   </w:r>
+                  <w:proofErr w:type="spellEnd"/>
                 </w:p>
               </w:tc>
             </w:tr>
@@ -4675,7 +5170,23 @@
                       </w:tcPr>
                       <w:p>
                         <w:r>
-                          <w:t>Включает/продлевает глобальный «локдаун» на заданное число секунд: вычисляет end и обновляет global_lock_until, если он больше текущего.</w:t>
+                          <w:t xml:space="preserve">Включает/продлевает глобальный «локдаун» на заданное число секунд: вычисляет </w:t>
+                        </w:r>
+                        <w:proofErr w:type="spellStart"/>
+                        <w:r>
+                          <w:t>end</w:t>
+                        </w:r>
+                        <w:proofErr w:type="spellEnd"/>
+                        <w:r>
+                          <w:t xml:space="preserve"> и обновляет </w:t>
+                        </w:r>
+                        <w:proofErr w:type="spellStart"/>
+                        <w:r>
+                          <w:t>global_lock_until</w:t>
+                        </w:r>
+                        <w:proofErr w:type="spellEnd"/>
+                        <w:r>
+                          <w:t>, если он больше текущего.</w:t>
                         </w:r>
                       </w:p>
                     </w:tc>
@@ -4779,6 +5290,7 @@
                 <w:bCs/>
               </w:rPr>
             </w:pPr>
+            <w:proofErr w:type="spellStart"/>
             <w:r>
               <w:rPr>
                 <w:b/>
@@ -4786,6 +5298,7 @@
               </w:rPr>
               <w:t>block_ip</w:t>
             </w:r>
+            <w:proofErr w:type="spellEnd"/>
           </w:p>
         </w:tc>
         <w:tc>
@@ -4993,6 +5506,7 @@
                 <w:lang w:val="en-US"/>
               </w:rPr>
             </w:pPr>
+            <w:proofErr w:type="spellStart"/>
             <w:r>
               <w:rPr>
                 <w:b/>
@@ -5000,6 +5514,7 @@
               </w:rPr>
               <w:t>arrival_history</w:t>
             </w:r>
+            <w:proofErr w:type="spellEnd"/>
           </w:p>
         </w:tc>
         <w:tc>
@@ -5037,7 +5552,15 @@
                   </w:r>
                   <w:r>
                     <w:lastRenderedPageBreak/>
-                    <w:t>источнику для подсчёта активности в окне и автблокировок.</w:t>
+                    <w:t xml:space="preserve">источнику для подсчёта активности в окне и </w:t>
+                  </w:r>
+                  <w:proofErr w:type="spellStart"/>
+                  <w:r>
+                    <w:t>автблокировок</w:t>
+                  </w:r>
+                  <w:proofErr w:type="spellEnd"/>
+                  <w:r>
+                    <w:t>.</w:t>
                   </w:r>
                 </w:p>
               </w:tc>
@@ -5102,6 +5625,7 @@
                 <w:lang w:val="en-US"/>
               </w:rPr>
             </w:pPr>
+            <w:proofErr w:type="spellStart"/>
             <w:r>
               <w:rPr>
                 <w:b/>
@@ -5110,6 +5634,7 @@
               <w:lastRenderedPageBreak/>
               <w:t>last_seen_ts</w:t>
             </w:r>
+            <w:proofErr w:type="spellEnd"/>
           </w:p>
         </w:tc>
         <w:tc>
@@ -5214,6 +5739,7 @@
                 <w:lang w:val="en-US"/>
               </w:rPr>
             </w:pPr>
+            <w:proofErr w:type="spellStart"/>
             <w:r>
               <w:rPr>
                 <w:b/>
@@ -5222,14 +5748,43 @@
               </w:rPr>
               <w:t>logs_dir</w:t>
             </w:r>
+            <w:proofErr w:type="spellEnd"/>
             <w:r>
               <w:rPr>
                 <w:b/>
                 <w:bCs/>
                 <w:lang w:val="en-US"/>
               </w:rPr>
-              <w:t>, whitelist_file, commands_file</w:t>
-            </w:r>
+              <w:t xml:space="preserve">, </w:t>
+            </w:r>
+            <w:proofErr w:type="spellStart"/>
+            <w:r>
+              <w:rPr>
+                <w:b/>
+                <w:bCs/>
+                <w:lang w:val="en-US"/>
+              </w:rPr>
+              <w:t>whitelist_file</w:t>
+            </w:r>
+            <w:proofErr w:type="spellEnd"/>
+            <w:r>
+              <w:rPr>
+                <w:b/>
+                <w:bCs/>
+                <w:lang w:val="en-US"/>
+              </w:rPr>
+              <w:t xml:space="preserve">, </w:t>
+            </w:r>
+            <w:proofErr w:type="spellStart"/>
+            <w:r>
+              <w:rPr>
+                <w:b/>
+                <w:bCs/>
+                <w:lang w:val="en-US"/>
+              </w:rPr>
+              <w:t>commands_file</w:t>
+            </w:r>
+            <w:proofErr w:type="spellEnd"/>
           </w:p>
         </w:tc>
         <w:tc>
@@ -5265,14 +5820,124 @@
                 <w:lang w:val="en-US"/>
               </w:rPr>
             </w:pPr>
+            <w:proofErr w:type="spellStart"/>
             <w:r>
               <w:rPr>
                 <w:b/>
                 <w:bCs/>
                 <w:lang w:val="en-US"/>
               </w:rPr>
-              <w:t>a.iface, a.bpf, a.block_threshold, a.block_window, a.block_duration, a.ddos_unique_threshold, a.ddos_duration</w:t>
-            </w:r>
+              <w:t>a.iface</w:t>
+            </w:r>
+            <w:proofErr w:type="spellEnd"/>
+            <w:r>
+              <w:rPr>
+                <w:b/>
+                <w:bCs/>
+                <w:lang w:val="en-US"/>
+              </w:rPr>
+              <w:t xml:space="preserve">, </w:t>
+            </w:r>
+            <w:proofErr w:type="spellStart"/>
+            <w:r>
+              <w:rPr>
+                <w:b/>
+                <w:bCs/>
+                <w:lang w:val="en-US"/>
+              </w:rPr>
+              <w:t>a.bpf</w:t>
+            </w:r>
+            <w:proofErr w:type="spellEnd"/>
+            <w:r>
+              <w:rPr>
+                <w:b/>
+                <w:bCs/>
+                <w:lang w:val="en-US"/>
+              </w:rPr>
+              <w:t xml:space="preserve">, </w:t>
+            </w:r>
+            <w:proofErr w:type="spellStart"/>
+            <w:r>
+              <w:rPr>
+                <w:b/>
+                <w:bCs/>
+                <w:lang w:val="en-US"/>
+              </w:rPr>
+              <w:t>a.block_threshold</w:t>
+            </w:r>
+            <w:proofErr w:type="spellEnd"/>
+            <w:r>
+              <w:rPr>
+                <w:b/>
+                <w:bCs/>
+                <w:lang w:val="en-US"/>
+              </w:rPr>
+              <w:t xml:space="preserve">, </w:t>
+            </w:r>
+            <w:proofErr w:type="spellStart"/>
+            <w:r>
+              <w:rPr>
+                <w:b/>
+                <w:bCs/>
+                <w:lang w:val="en-US"/>
+              </w:rPr>
+              <w:t>a.block_window</w:t>
+            </w:r>
+            <w:proofErr w:type="spellEnd"/>
+            <w:r>
+              <w:rPr>
+                <w:b/>
+                <w:bCs/>
+                <w:lang w:val="en-US"/>
+              </w:rPr>
+              <w:t xml:space="preserve">, </w:t>
+            </w:r>
+            <w:proofErr w:type="spellStart"/>
+            <w:r>
+              <w:rPr>
+                <w:b/>
+                <w:bCs/>
+                <w:lang w:val="en-US"/>
+              </w:rPr>
+              <w:t>a.block_duration</w:t>
+            </w:r>
+            <w:proofErr w:type="spellEnd"/>
+            <w:r>
+              <w:rPr>
+                <w:b/>
+                <w:bCs/>
+                <w:lang w:val="en-US"/>
+              </w:rPr>
+              <w:t xml:space="preserve">, </w:t>
+            </w:r>
+            <w:proofErr w:type="spellStart"/>
+            <w:r>
+              <w:rPr>
+                <w:b/>
+                <w:bCs/>
+                <w:lang w:val="en-US"/>
+              </w:rPr>
+              <w:t>a.ddos_unique_threshold</w:t>
+            </w:r>
+            <w:proofErr w:type="spellEnd"/>
+            <w:r>
+              <w:rPr>
+                <w:b/>
+                <w:bCs/>
+                <w:lang w:val="en-US"/>
+              </w:rPr>
+              <w:t xml:space="preserve">, </w:t>
+            </w:r>
+            <w:proofErr w:type="spellStart"/>
+            <w:r>
+              <w:rPr>
+                <w:b/>
+                <w:bCs/>
+                <w:lang w:val="en-US"/>
+              </w:rPr>
+              <w:t>a.ddos_duration</w:t>
+            </w:r>
+            <w:proofErr w:type="spellEnd"/>
           </w:p>
         </w:tc>
         <w:tc>
@@ -5317,12 +5982,14 @@
                   <w:r>
                     <w:t xml:space="preserve">-фильтр, количество пакетов от одного </w:t>
                   </w:r>
+                  <w:proofErr w:type="spellStart"/>
                   <w:r>
                     <w:rPr>
                       <w:lang w:val="en-US"/>
                     </w:rPr>
                     <w:t>ip</w:t>
                   </w:r>
+                  <w:proofErr w:type="spellEnd"/>
                   <w:r>
                     <w:t xml:space="preserve"> </w:t>
                   </w:r>
@@ -6175,12 +6842,14 @@
       <w:r>
         <w:br/>
       </w:r>
+      <w:proofErr w:type="spellStart"/>
       <w:r>
         <w:rPr>
           <w:lang w:val="en-US"/>
         </w:rPr>
         <w:t>sudo</w:t>
       </w:r>
+      <w:proofErr w:type="spellEnd"/>
       <w:r>
         <w:t xml:space="preserve"> </w:t>
       </w:r>
@@ -6258,7 +6927,55 @@
         <w:t>BPF</w:t>
       </w:r>
       <w:r>
-        <w:t>-фильтр (например: ip, tcp, tcp port 80, not host 10.0.0.1).</w:t>
+        <w:t xml:space="preserve">-фильтр (например: </w:t>
+      </w:r>
+      <w:proofErr w:type="spellStart"/>
+      <w:r>
+        <w:t>ip</w:t>
+      </w:r>
+      <w:proofErr w:type="spellEnd"/>
+      <w:r>
+        <w:t xml:space="preserve">, </w:t>
+      </w:r>
+      <w:proofErr w:type="spellStart"/>
+      <w:r>
+        <w:t>tcp</w:t>
+      </w:r>
+      <w:proofErr w:type="spellEnd"/>
+      <w:r>
+        <w:t xml:space="preserve">, </w:t>
+      </w:r>
+      <w:proofErr w:type="spellStart"/>
+      <w:r>
+        <w:t>tcp</w:t>
+      </w:r>
+      <w:proofErr w:type="spellEnd"/>
+      <w:r>
+        <w:t xml:space="preserve"> </w:t>
+      </w:r>
+      <w:proofErr w:type="spellStart"/>
+      <w:r>
+        <w:t>port</w:t>
+      </w:r>
+      <w:proofErr w:type="spellEnd"/>
+      <w:r>
+        <w:t xml:space="preserve"> 80, </w:t>
+      </w:r>
+      <w:proofErr w:type="spellStart"/>
+      <w:r>
+        <w:t>not</w:t>
+      </w:r>
+      <w:proofErr w:type="spellEnd"/>
+      <w:r>
+        <w:t xml:space="preserve"> </w:t>
+      </w:r>
+      <w:proofErr w:type="spellStart"/>
+      <w:r>
+        <w:t>host</w:t>
+      </w:r>
+      <w:proofErr w:type="spellEnd"/>
+      <w:r>
+        <w:t xml:space="preserve"> 10.0.0.1).</w:t>
       </w:r>
     </w:p>
     <w:p>
@@ -6270,7 +6987,31 @@
         </w:numPr>
       </w:pPr>
       <w:r>
-        <w:t xml:space="preserve"> Первый запуск выполните без авто-блокировки; затем включайте её и подбирайте threshold/window/duration.</w:t>
+        <w:t xml:space="preserve"> Первый запуск выполните без авто-блокировки; затем включайте её и подбирайте </w:t>
+      </w:r>
+      <w:proofErr w:type="spellStart"/>
+      <w:r>
+        <w:t>threshold</w:t>
+      </w:r>
+      <w:proofErr w:type="spellEnd"/>
+      <w:r>
+        <w:t>/</w:t>
+      </w:r>
+      <w:proofErr w:type="spellStart"/>
+      <w:r>
+        <w:t>window</w:t>
+      </w:r>
+      <w:proofErr w:type="spellEnd"/>
+      <w:r>
+        <w:t>/</w:t>
+      </w:r>
+      <w:proofErr w:type="spellStart"/>
+      <w:r>
+        <w:t>duration</w:t>
+      </w:r>
+      <w:proofErr w:type="spellEnd"/>
+      <w:r>
+        <w:t>.</w:t>
       </w:r>
     </w:p>
     <w:p>
@@ -6284,6 +7025,7 @@
       <w:r>
         <w:t xml:space="preserve"> Сразу добавьте доверенные адреса в </w:t>
       </w:r>
+      <w:proofErr w:type="spellStart"/>
       <w:r>
         <w:rPr>
           <w:rStyle w:val="HTML"/>
@@ -6293,6 +7035,7 @@
         </w:rPr>
         <w:t>whitelist</w:t>
       </w:r>
+      <w:proofErr w:type="spellEnd"/>
       <w:r>
         <w:t>.</w:t>
       </w:r>
@@ -6340,15 +7083,41 @@
       <w:r>
         <w:t xml:space="preserve"> и </w:t>
       </w:r>
+      <w:proofErr w:type="spellStart"/>
       <w:r>
         <w:rPr>
           <w:b/>
           <w:bCs/>
         </w:rPr>
-        <w:t>Whitelist/Unwhitelist</w:t>
-      </w:r>
-      <w:r>
-        <w:t>; все действия журналируются.</w:t>
+        <w:t>Whitelist</w:t>
+      </w:r>
+      <w:proofErr w:type="spellEnd"/>
+      <w:r>
+        <w:rPr>
+          <w:b/>
+          <w:bCs/>
+        </w:rPr>
+        <w:t>/</w:t>
+      </w:r>
+      <w:proofErr w:type="spellStart"/>
+      <w:r>
+        <w:rPr>
+          <w:b/>
+          <w:bCs/>
+        </w:rPr>
+        <w:t>Unwhitelist</w:t>
+      </w:r>
+      <w:proofErr w:type="spellEnd"/>
+      <w:r>
+        <w:t xml:space="preserve">; все действия </w:t>
+      </w:r>
+      <w:proofErr w:type="spellStart"/>
+      <w:r>
+        <w:t>журналируются</w:t>
+      </w:r>
+      <w:proofErr w:type="spellEnd"/>
+      <w:r>
+        <w:t>.</w:t>
       </w:r>
     </w:p>
     <w:p>
@@ -6362,9 +7131,11 @@
       <w:r>
         <w:t xml:space="preserve">При всплеске уникальных источников включается глобальный локдаун («все, кроме </w:t>
       </w:r>
+      <w:proofErr w:type="spellStart"/>
       <w:r>
         <w:t>whitelist</w:t>
       </w:r>
+      <w:proofErr w:type="spellEnd"/>
       <w:r>
         <w:t>»).</w:t>
       </w:r>
@@ -6468,7 +7239,15 @@
         <w:t>GUI</w:t>
       </w:r>
       <w:r>
-        <w:t xml:space="preserve"> или Ctrl+C.</w:t>
+        <w:t xml:space="preserve"> или </w:t>
+      </w:r>
+      <w:proofErr w:type="spellStart"/>
+      <w:r>
+        <w:t>Ctrl+C</w:t>
+      </w:r>
+      <w:proofErr w:type="spellEnd"/>
+      <w:r>
+        <w:t>.</w:t>
       </w:r>
     </w:p>
     <w:p>
@@ -6539,7 +7318,55 @@
         <w:t>Настройка окружения</w:t>
       </w:r>
       <w:r>
-        <w:t>: Рекомендуется Python 3.9+ (Linux предпочтителен), установленный libpcap и пакеты scapy и PyQt5. Для сниффинга выдайте процессу права (запуск от root или Linux-capabilities CAP_NET_RAW и CAP_NET_ADMIN), убедитесь в доступности нужного сетевого интерфейса, подготовьте каталог logs/ для записи и синхронизируйте системное время (UTC) для корректных меток в JSONL.</w:t>
+        <w:t xml:space="preserve">: Рекомендуется Python 3.9+ (Linux предпочтителен), установленный </w:t>
+      </w:r>
+      <w:proofErr w:type="spellStart"/>
+      <w:r>
+        <w:t>libpcap</w:t>
+      </w:r>
+      <w:proofErr w:type="spellEnd"/>
+      <w:r>
+        <w:t xml:space="preserve"> и пакеты </w:t>
+      </w:r>
+      <w:proofErr w:type="spellStart"/>
+      <w:r>
+        <w:t>scapy</w:t>
+      </w:r>
+      <w:proofErr w:type="spellEnd"/>
+      <w:r>
+        <w:t xml:space="preserve"> и PyQt5. Для </w:t>
+      </w:r>
+      <w:proofErr w:type="spellStart"/>
+      <w:r>
+        <w:t>сниффинга</w:t>
+      </w:r>
+      <w:proofErr w:type="spellEnd"/>
+      <w:r>
+        <w:t xml:space="preserve"> выдайте процессу права (запуск от </w:t>
+      </w:r>
+      <w:proofErr w:type="spellStart"/>
+      <w:r>
+        <w:t>root</w:t>
+      </w:r>
+      <w:proofErr w:type="spellEnd"/>
+      <w:r>
+        <w:t xml:space="preserve"> или Linux-</w:t>
+      </w:r>
+      <w:proofErr w:type="spellStart"/>
+      <w:r>
+        <w:t>capabilities</w:t>
+      </w:r>
+      <w:proofErr w:type="spellEnd"/>
+      <w:r>
+        <w:t xml:space="preserve"> CAP_NET_RAW и CAP_NET_ADMIN), убедитесь в доступности нужного сетевого интерфейса, подготовьте каталог </w:t>
+      </w:r>
+      <w:proofErr w:type="spellStart"/>
+      <w:r>
+        <w:t>logs</w:t>
+      </w:r>
+      <w:proofErr w:type="spellEnd"/>
+      <w:r>
+        <w:t>/ для записи и синхронизируйте системное время (UTC) для корректных меток в JSONL.</w:t>
       </w:r>
     </w:p>
     <w:p>
@@ -6565,7 +7392,103 @@
       </w:r>
       <w:r>
         <w:lastRenderedPageBreak/>
-        <w:t>— за набор правил, blocker.py — за пер-IP и глобальные блокировки и whitelist, detector_ui.py — за GUI и запуск подпроцесса. Обмен между ядром и интерфейсом организован через поток stdout (JSON-события) и файл команд logs/commands.jsonl, аудит whitelist ведётся в logs/whitelist.jsonl; контракт вызовов к blocker фиксируйте на уровне is_whitelisted / is_blocked / block_ip / set_global_lockdown.</w:t>
+        <w:t xml:space="preserve">— за набор правил, blocker.py — за пер-IP и глобальные блокировки и </w:t>
+      </w:r>
+      <w:proofErr w:type="spellStart"/>
+      <w:r>
+        <w:t>whitelist</w:t>
+      </w:r>
+      <w:proofErr w:type="spellEnd"/>
+      <w:r>
+        <w:t xml:space="preserve">, detector_ui.py — за GUI и запуск подпроцесса. Обмен между ядром и интерфейсом организован через поток </w:t>
+      </w:r>
+      <w:proofErr w:type="spellStart"/>
+      <w:r>
+        <w:t>stdout</w:t>
+      </w:r>
+      <w:proofErr w:type="spellEnd"/>
+      <w:r>
+        <w:t xml:space="preserve"> (JSON-события) и файл команд </w:t>
+      </w:r>
+      <w:proofErr w:type="spellStart"/>
+      <w:r>
+        <w:t>logs</w:t>
+      </w:r>
+      <w:proofErr w:type="spellEnd"/>
+      <w:r>
+        <w:t>/</w:t>
+      </w:r>
+      <w:proofErr w:type="spellStart"/>
+      <w:r>
+        <w:t>commands.jsonl</w:t>
+      </w:r>
+      <w:proofErr w:type="spellEnd"/>
+      <w:r>
+        <w:t xml:space="preserve">, аудит </w:t>
+      </w:r>
+      <w:proofErr w:type="spellStart"/>
+      <w:r>
+        <w:t>whitelist</w:t>
+      </w:r>
+      <w:proofErr w:type="spellEnd"/>
+      <w:r>
+        <w:t xml:space="preserve"> ведётся в </w:t>
+      </w:r>
+      <w:proofErr w:type="spellStart"/>
+      <w:r>
+        <w:t>logs</w:t>
+      </w:r>
+      <w:proofErr w:type="spellEnd"/>
+      <w:r>
+        <w:t>/</w:t>
+      </w:r>
+      <w:proofErr w:type="spellStart"/>
+      <w:r>
+        <w:t>whitelist.jsonl</w:t>
+      </w:r>
+      <w:proofErr w:type="spellEnd"/>
+      <w:r>
+        <w:t xml:space="preserve">; контракт вызовов к </w:t>
+      </w:r>
+      <w:proofErr w:type="spellStart"/>
+      <w:r>
+        <w:t>blocker</w:t>
+      </w:r>
+      <w:proofErr w:type="spellEnd"/>
+      <w:r>
+        <w:t xml:space="preserve"> фиксируйте на уровне </w:t>
+      </w:r>
+      <w:proofErr w:type="spellStart"/>
+      <w:r>
+        <w:t>is_whitelisted</w:t>
+      </w:r>
+      <w:proofErr w:type="spellEnd"/>
+      <w:r>
+        <w:t xml:space="preserve"> / </w:t>
+      </w:r>
+      <w:proofErr w:type="spellStart"/>
+      <w:r>
+        <w:t>is_blocked</w:t>
+      </w:r>
+      <w:proofErr w:type="spellEnd"/>
+      <w:r>
+        <w:t xml:space="preserve"> / </w:t>
+      </w:r>
+      <w:proofErr w:type="spellStart"/>
+      <w:r>
+        <w:t>block_ip</w:t>
+      </w:r>
+      <w:proofErr w:type="spellEnd"/>
+      <w:r>
+        <w:t xml:space="preserve"> / </w:t>
+      </w:r>
+      <w:proofErr w:type="spellStart"/>
+      <w:r>
+        <w:t>set_global_lockdown</w:t>
+      </w:r>
+      <w:proofErr w:type="spellEnd"/>
+      <w:r>
+        <w:t>.</w:t>
       </w:r>
     </w:p>
     <w:p>
@@ -6587,7 +7510,103 @@
         <w:t>Модификация программы</w:t>
       </w:r>
       <w:r>
-        <w:t>: Новые детекторы добавляйте в rules.py в виде функций вида rule_x(pkt, state) → (bool, reason) и подключайте их в handle_packet, а пороги и окна делайте конфигурируемыми через CLI/GUI или внешний config.json, избегая хардкода. При изменениях схемы логов поддерживайте версионирование и, при необходимости «жёсткой» блокировки, добавьте адаптер к системному фаерволу (iptables/nftables/Windows Firewall) с детальным аудитом.</w:t>
+        <w:t xml:space="preserve">: Новые детекторы добавляйте в rules.py в виде функций вида </w:t>
+      </w:r>
+      <w:proofErr w:type="spellStart"/>
+      <w:r>
+        <w:t>rule_x</w:t>
+      </w:r>
+      <w:proofErr w:type="spellEnd"/>
+      <w:r>
+        <w:t>(</w:t>
+      </w:r>
+      <w:proofErr w:type="spellStart"/>
+      <w:r>
+        <w:t>pkt</w:t>
+      </w:r>
+      <w:proofErr w:type="spellEnd"/>
+      <w:r>
+        <w:t xml:space="preserve">, </w:t>
+      </w:r>
+      <w:proofErr w:type="spellStart"/>
+      <w:r>
+        <w:t>state</w:t>
+      </w:r>
+      <w:proofErr w:type="spellEnd"/>
+      <w:r>
+        <w:t>) → (</w:t>
+      </w:r>
+      <w:proofErr w:type="spellStart"/>
+      <w:r>
+        <w:t>bool</w:t>
+      </w:r>
+      <w:proofErr w:type="spellEnd"/>
+      <w:r>
+        <w:t xml:space="preserve">, </w:t>
+      </w:r>
+      <w:proofErr w:type="spellStart"/>
+      <w:r>
+        <w:t>reason</w:t>
+      </w:r>
+      <w:proofErr w:type="spellEnd"/>
+      <w:r>
+        <w:t xml:space="preserve">) и подключайте их в </w:t>
+      </w:r>
+      <w:proofErr w:type="spellStart"/>
+      <w:r>
+        <w:t>handle_packet</w:t>
+      </w:r>
+      <w:proofErr w:type="spellEnd"/>
+      <w:r>
+        <w:t xml:space="preserve">, а пороги и окна делайте конфигурируемыми через CLI/GUI или внешний </w:t>
+      </w:r>
+      <w:proofErr w:type="spellStart"/>
+      <w:r>
+        <w:t>config.json</w:t>
+      </w:r>
+      <w:proofErr w:type="spellEnd"/>
+      <w:r>
+        <w:t xml:space="preserve">, избегая </w:t>
+      </w:r>
+      <w:proofErr w:type="spellStart"/>
+      <w:r>
+        <w:t>хардкода</w:t>
+      </w:r>
+      <w:proofErr w:type="spellEnd"/>
+      <w:r>
+        <w:t xml:space="preserve">. При изменениях схемы логов поддерживайте </w:t>
+      </w:r>
+      <w:proofErr w:type="spellStart"/>
+      <w:r>
+        <w:t>версионирование</w:t>
+      </w:r>
+      <w:proofErr w:type="spellEnd"/>
+      <w:r>
+        <w:t xml:space="preserve"> и, при необходимости «жёсткой» блокировки, добавьте адаптер к системному </w:t>
+      </w:r>
+      <w:proofErr w:type="spellStart"/>
+      <w:r>
+        <w:t>фаерволу</w:t>
+      </w:r>
+      <w:proofErr w:type="spellEnd"/>
+      <w:r>
+        <w:t xml:space="preserve"> (</w:t>
+      </w:r>
+      <w:proofErr w:type="spellStart"/>
+      <w:r>
+        <w:t>iptables</w:t>
+      </w:r>
+      <w:proofErr w:type="spellEnd"/>
+      <w:r>
+        <w:t>/</w:t>
+      </w:r>
+      <w:proofErr w:type="spellStart"/>
+      <w:r>
+        <w:t>nftables</w:t>
+      </w:r>
+      <w:proofErr w:type="spellEnd"/>
+      <w:r>
+        <w:t>/Windows Firewall) с детальным аудитом.</w:t>
       </w:r>
     </w:p>
     <w:p>
@@ -6609,7 +7628,79 @@
         <w:t>Оптимизация, тестирование и эксплуатация</w:t>
       </w:r>
       <w:r>
-        <w:t>: Сужайте поток трафика BPF-фильтрами, оставляйте store=False и избегайте тяжёлых операций в handle_packet; структуры состояния ограничивайте по времени (TTL/deque), а запись логов и обработку команд при высокой нагрузке выносите в отдельный поток или очередь и увеличивайте pcap-буфер. Пишите юнит-тесты (pytest) для rules и blocker, проводите e2e-проверки на синтетическом трафике и PCAP, включайте ротацию логов и базовые метрики (pps, число триггеров, активные блокировки) для мониторинга в эксплуатации.</w:t>
+        <w:t xml:space="preserve">: Сужайте поток трафика BPF-фильтрами, оставляйте </w:t>
+      </w:r>
+      <w:proofErr w:type="spellStart"/>
+      <w:r>
+        <w:t>store</w:t>
+      </w:r>
+      <w:proofErr w:type="spellEnd"/>
+      <w:r>
+        <w:t>=</w:t>
+      </w:r>
+      <w:proofErr w:type="spellStart"/>
+      <w:r>
+        <w:t>False</w:t>
+      </w:r>
+      <w:proofErr w:type="spellEnd"/>
+      <w:r>
+        <w:t xml:space="preserve"> и избегайте тяжёлых операций в </w:t>
+      </w:r>
+      <w:proofErr w:type="spellStart"/>
+      <w:r>
+        <w:t>handle_packet</w:t>
+      </w:r>
+      <w:proofErr w:type="spellEnd"/>
+      <w:r>
+        <w:t>; структуры состояния ограничивайте по времени (TTL/</w:t>
+      </w:r>
+      <w:proofErr w:type="spellStart"/>
+      <w:r>
+        <w:t>deque</w:t>
+      </w:r>
+      <w:proofErr w:type="spellEnd"/>
+      <w:r>
+        <w:t xml:space="preserve">), а запись логов и обработку команд при высокой нагрузке выносите в отдельный поток или очередь и увеличивайте </w:t>
+      </w:r>
+      <w:proofErr w:type="spellStart"/>
+      <w:r>
+        <w:t>pcap</w:t>
+      </w:r>
+      <w:proofErr w:type="spellEnd"/>
+      <w:r>
+        <w:t>-буфер. Пишите юнит-тесты (</w:t>
+      </w:r>
+      <w:proofErr w:type="spellStart"/>
+      <w:r>
+        <w:t>pytest</w:t>
+      </w:r>
+      <w:proofErr w:type="spellEnd"/>
+      <w:r>
+        <w:t xml:space="preserve">) для </w:t>
+      </w:r>
+      <w:proofErr w:type="spellStart"/>
+      <w:r>
+        <w:t>rules</w:t>
+      </w:r>
+      <w:proofErr w:type="spellEnd"/>
+      <w:r>
+        <w:t xml:space="preserve"> и </w:t>
+      </w:r>
+      <w:proofErr w:type="spellStart"/>
+      <w:r>
+        <w:t>blocker</w:t>
+      </w:r>
+      <w:proofErr w:type="spellEnd"/>
+      <w:r>
+        <w:t>, проводите e2e-проверки на синтетическом трафике и PCAP, включайте ротацию логов и базовые метрики (</w:t>
+      </w:r>
+      <w:proofErr w:type="spellStart"/>
+      <w:r>
+        <w:t>pps</w:t>
+      </w:r>
+      <w:proofErr w:type="spellEnd"/>
+      <w:r>
+        <w:t>, число триггеров, активные блокировки) для мониторинга в эксплуатации.</w:t>
       </w:r>
     </w:p>
     <w:p/>
@@ -6636,7 +7727,47 @@
             <w14:round/>
           </w14:textOutline>
         </w:rPr>
-        <w:t>Исслндование</w:t>
+        <w:t>Иссл</w:t>
+      </w:r>
+      <w:r>
+        <w:rPr>
+          <w:rStyle w:val="ab"/>
+          <w:rFonts w:ascii="Times New Roman" w:hAnsi="Times New Roman" w:cs="Times New Roman"/>
+          <w:color w:val="000000" w:themeColor="text1"/>
+          <w:sz w:val="28"/>
+          <w:szCs w:val="28"/>
+          <w14:shadow w14:blurRad="38100" w14:dist="19050" w14:dir="2700000" w14:sx="100000" w14:sy="100000" w14:kx="0" w14:ky="0" w14:algn="tl">
+            <w14:schemeClr w14:val="dk1">
+              <w14:alpha w14:val="60000"/>
+            </w14:schemeClr>
+          </w14:shadow>
+          <w14:textOutline w14:w="0" w14:cap="flat" w14:cmpd="sng" w14:algn="ctr">
+            <w14:noFill/>
+            <w14:prstDash w14:val="solid"/>
+            <w14:round/>
+          </w14:textOutline>
+        </w:rPr>
+        <w:t>е</w:t>
+      </w:r>
+      <w:r>
+        <w:rPr>
+          <w:rStyle w:val="ab"/>
+          <w:rFonts w:ascii="Times New Roman" w:hAnsi="Times New Roman" w:cs="Times New Roman"/>
+          <w:color w:val="000000" w:themeColor="text1"/>
+          <w:sz w:val="28"/>
+          <w:szCs w:val="28"/>
+          <w14:shadow w14:blurRad="38100" w14:dist="19050" w14:dir="2700000" w14:sx="100000" w14:sy="100000" w14:kx="0" w14:ky="0" w14:algn="tl">
+            <w14:schemeClr w14:val="dk1">
+              <w14:alpha w14:val="60000"/>
+            </w14:schemeClr>
+          </w14:shadow>
+          <w14:textOutline w14:w="0" w14:cap="flat" w14:cmpd="sng" w14:algn="ctr">
+            <w14:noFill/>
+            <w14:prstDash w14:val="solid"/>
+            <w14:round/>
+          </w14:textOutline>
+        </w:rPr>
+        <w:t>дование</w:t>
       </w:r>
       <w:bookmarkEnd w:id="9"/>
     </w:p>
@@ -6645,8 +7776,17 @@
         <w:ind w:left="708"/>
       </w:pPr>
       <w:r>
-        <w:t xml:space="preserve">Для симуляции атаки с Windows-хоста протестированы режимы сети ВМ: NAT и Bridged. NAT дал слабую наблюдаемость (пакеты с Windows не видны внутри ВМ), поэтому выбран </w:t>
-      </w:r>
+        <w:t xml:space="preserve">Для симуляции атаки с Windows-хоста протестированы режимы сети ВМ: NAT и </w:t>
+      </w:r>
+      <w:proofErr w:type="spellStart"/>
+      <w:r>
+        <w:t>Bridged</w:t>
+      </w:r>
+      <w:proofErr w:type="spellEnd"/>
+      <w:r>
+        <w:t xml:space="preserve">. NAT дал слабую наблюдаемость (пакеты с Windows не видны внутри ВМ), поэтому выбран </w:t>
+      </w:r>
+      <w:proofErr w:type="spellStart"/>
       <w:r>
         <w:rPr>
           <w:b/>
@@ -6654,18 +7794,52 @@
         </w:rPr>
         <w:t>Bridged</w:t>
       </w:r>
-      <w:r>
-        <w:t xml:space="preserve">: адаптер ВМ привязан к физическому интерфейсу хоста, «кабель подключён», при наличии promiscuous-режима — </w:t>
-      </w:r>
+      <w:proofErr w:type="spellEnd"/>
+      <w:r>
+        <w:t xml:space="preserve">: адаптер ВМ привязан к физическому интерфейсу хоста, «кабель подключён», при наличии </w:t>
+      </w:r>
+      <w:proofErr w:type="spellStart"/>
+      <w:r>
+        <w:t>promiscuous</w:t>
+      </w:r>
+      <w:proofErr w:type="spellEnd"/>
+      <w:r>
+        <w:t xml:space="preserve">-режима — </w:t>
+      </w:r>
+      <w:proofErr w:type="spellStart"/>
       <w:r>
         <w:rPr>
           <w:b/>
           <w:bCs/>
         </w:rPr>
-        <w:t>Allow All</w:t>
-      </w:r>
-      <w:r>
-        <w:t>; ВМ получает IP в той же подсети. В детекторе указывался интерфейс (напр., enp0s3) и фильтр ip/icmp.</w:t>
+        <w:t>Allow</w:t>
+      </w:r>
+      <w:proofErr w:type="spellEnd"/>
+      <w:r>
+        <w:rPr>
+          <w:b/>
+          <w:bCs/>
+        </w:rPr>
+        <w:t xml:space="preserve"> All</w:t>
+      </w:r>
+      <w:r>
+        <w:t xml:space="preserve">; ВМ получает IP в той же подсети. В детекторе указывался интерфейс (напр., enp0s3) и фильтр </w:t>
+      </w:r>
+      <w:proofErr w:type="spellStart"/>
+      <w:r>
+        <w:t>ip</w:t>
+      </w:r>
+      <w:proofErr w:type="spellEnd"/>
+      <w:r>
+        <w:t>/</w:t>
+      </w:r>
+      <w:proofErr w:type="spellStart"/>
+      <w:r>
+        <w:t>icmp</w:t>
+      </w:r>
+      <w:proofErr w:type="spellEnd"/>
+      <w:r>
+        <w:t>.</w:t>
       </w:r>
     </w:p>
     <w:p>
@@ -6759,15 +7933,57 @@
         <w:lastRenderedPageBreak/>
         <w:t xml:space="preserve">Из вариантов противодействия DDOS выбран </w:t>
       </w:r>
+      <w:proofErr w:type="spellStart"/>
       <w:r>
         <w:rPr>
           <w:b/>
           <w:bCs/>
         </w:rPr>
-        <w:t>lockdown + whitelist</w:t>
-      </w:r>
-      <w:r>
-        <w:t>: при всплеске числа уникальных источников включается кратковременная блокировка «все, кроме доверенных». Метод быстро гасит шквал и не отключает критичные адреса. Для демонстрации рекомендованы параметры: --ddos-unique-threshold 15 --ddos-window-sec 5 --ddos-duration 10–30 (допустимо уменьшить пороги на стенде с малым числом источников).</w:t>
+        <w:t>lockdown</w:t>
+      </w:r>
+      <w:proofErr w:type="spellEnd"/>
+      <w:r>
+        <w:rPr>
+          <w:b/>
+          <w:bCs/>
+        </w:rPr>
+        <w:t xml:space="preserve"> + </w:t>
+      </w:r>
+      <w:proofErr w:type="spellStart"/>
+      <w:r>
+        <w:rPr>
+          <w:b/>
+          <w:bCs/>
+        </w:rPr>
+        <w:t>whitelist</w:t>
+      </w:r>
+      <w:proofErr w:type="spellEnd"/>
+      <w:r>
+        <w:t>: при всплеске числа уникальных источников включается кратковременная блокировка «все, кроме доверенных». Метод быстро гасит шквал и не отключает критичные адреса. Для демонстрации рекомендованы параметры: --</w:t>
+      </w:r>
+      <w:proofErr w:type="spellStart"/>
+      <w:r>
+        <w:t>ddos-unique-threshold</w:t>
+      </w:r>
+      <w:proofErr w:type="spellEnd"/>
+      <w:r>
+        <w:t xml:space="preserve"> 15 --</w:t>
+      </w:r>
+      <w:proofErr w:type="spellStart"/>
+      <w:r>
+        <w:t>ddos-window-sec</w:t>
+      </w:r>
+      <w:proofErr w:type="spellEnd"/>
+      <w:r>
+        <w:t xml:space="preserve"> 5 --</w:t>
+      </w:r>
+      <w:proofErr w:type="spellStart"/>
+      <w:r>
+        <w:t>ddos-duration</w:t>
+      </w:r>
+      <w:proofErr w:type="spellEnd"/>
+      <w:r>
+        <w:t xml:space="preserve"> 10–30 (допустимо уменьшить пороги на стенде с малым числом источников).</w:t>
       </w:r>
     </w:p>
     <w:p>
@@ -6849,27 +8065,71 @@
         <w:ind w:firstLine="708"/>
       </w:pPr>
       <w:r>
-        <w:t xml:space="preserve">Реализована модульная система онлайн-детекции сетевых аномалий с автоматическими и ручными мерами реагирования: ядро на Scapy анализирует трафик в реальном времени, правила комбинируют поведенческие и сигнатурные признаки, а подсистема блокировок поддерживает пер-IP блок и краткосрочный </w:t>
-      </w:r>
+        <w:t xml:space="preserve">Реализована модульная система онлайн-детекции сетевых аномалий с автоматическими и ручными мерами реагирования: ядро на </w:t>
+      </w:r>
+      <w:proofErr w:type="spellStart"/>
+      <w:r>
+        <w:t>Scapy</w:t>
+      </w:r>
+      <w:proofErr w:type="spellEnd"/>
+      <w:r>
+        <w:t xml:space="preserve"> анализирует трафик в реальном времени, правила комбинируют поведенческие и сигнатурные признаки, а подсистема блокировок поддерживает пер-IP блок и краткосрочный </w:t>
+      </w:r>
+      <w:proofErr w:type="spellStart"/>
       <w:r>
         <w:rPr>
           <w:b/>
           <w:bCs/>
         </w:rPr>
-        <w:t>lockdown + whitelist</w:t>
-      </w:r>
-      <w:r>
-        <w:t xml:space="preserve"> для подавления всплесков по числу источников. GUI на PyQt5 обеспечивает запуск, наблюдение и управление. Для демонстрации с Windows-хоста оптимален сетевой режим ВМ </w:t>
-      </w:r>
+        <w:t>lockdown</w:t>
+      </w:r>
+      <w:proofErr w:type="spellEnd"/>
       <w:r>
         <w:rPr>
           <w:b/>
           <w:bCs/>
         </w:rPr>
+        <w:t xml:space="preserve"> + </w:t>
+      </w:r>
+      <w:proofErr w:type="spellStart"/>
+      <w:r>
+        <w:rPr>
+          <w:b/>
+          <w:bCs/>
+        </w:rPr>
+        <w:t>whitelist</w:t>
+      </w:r>
+      <w:proofErr w:type="spellEnd"/>
+      <w:r>
+        <w:t xml:space="preserve"> для подавления всплесков по числу источников. GUI на PyQt5 обеспечивает запуск, наблюдение и управление. Для демонстрации с Windows-хоста оптимален сетевой режим ВМ </w:t>
+      </w:r>
+      <w:proofErr w:type="spellStart"/>
+      <w:r>
+        <w:rPr>
+          <w:b/>
+          <w:bCs/>
+        </w:rPr>
         <w:t>Bridged</w:t>
       </w:r>
-      <w:r>
-        <w:t>, что подтверждено практическими тестами (ICMP ping). Логи в формате JSONL упрощают аудит и последующий анализ. Решение легко расширяется новыми правилами и интеграцией с системным фаерволом.</w:t>
+      <w:proofErr w:type="spellEnd"/>
+      <w:r>
+        <w:t xml:space="preserve">, что подтверждено практическими тестами (ICMP </w:t>
+      </w:r>
+      <w:proofErr w:type="spellStart"/>
+      <w:r>
+        <w:t>ping</w:t>
+      </w:r>
+      <w:proofErr w:type="spellEnd"/>
+      <w:r>
+        <w:t xml:space="preserve">). Логи в формате JSONL упрощают аудит и последующий анализ. Решение легко расширяется новыми правилами и интеграцией с системным </w:t>
+      </w:r>
+      <w:proofErr w:type="spellStart"/>
+      <w:r>
+        <w:t>фаерволом</w:t>
+      </w:r>
+      <w:proofErr w:type="spellEnd"/>
+      <w:r>
+        <w:t>.</w:t>
       </w:r>
     </w:p>
     <w:p>

</xml_diff>